<commit_message>
fix: replace all hardcoded dates and personal data in all template folders (CETINEI, CLINCENI, ORHIDEELOR, FORTUNEI) with placeholders
</commit_message>
<xml_diff>
--- a/public/templates-clean/cetinei/ACORD GDPR.docx
+++ b/public/templates-clean/cetinei/ACORD GDPR.docx
@@ -102,7 +102,7 @@
           <w:kern w:val="0"/>
           <w14:ligatures w14:val="none"/>
         </w:rPr>
-        <w:t>/18.12</w:t>
+        <w:t>/{DATA_CONTRACT}</w:t>
       </w:r>
       <w:r>
         <w:rPr>
@@ -112,7 +112,7 @@
           <w:kern w:val="0"/>
           <w14:ligatures w14:val="none"/>
         </w:rPr>
-        <w:t>.2025</w:t>
+        <w:t/>
       </w:r>
     </w:p>
     <w:p>

</xml_diff>